<commit_message>
fix: remove double quarto fence from 06_discussion.fr.qmd and A4_methodology.fr.qmd, re-render
</commit_message>
<xml_diff>
--- a/docs/fr/rural-obs-PAs.docx
+++ b/docs/fr/rural-obs-PAs.docx
@@ -11295,13 +11295,13 @@
       </w:r>
     </w:p>
     <w:bookmarkEnd w:id="153"/>
-    <w:bookmarkStart w:id="154" w:name="quarto"/>
+    <w:bookmarkStart w:id="154" w:name="discussion"/>
     <w:p>
       <w:pPr>
         <w:pStyle w:val="Heading1"/>
       </w:pPr>
       <w:r>
-        <w:t xml:space="preserve">23. ```quarto</w:t>
+        <w:t xml:space="preserve">23. Discussion</w:t>
       </w:r>
     </w:p>
     <w:p>
@@ -11309,31 +11309,15 @@
         <w:pStyle w:val="FirstParagraph"/>
       </w:pPr>
       <w:r>
-        <w:t xml:space="preserve">title:</w:t>
-      </w:r>
-      <w:r>
-        <w:t xml:space="preserve"> </w:t>
-      </w:r>
-      <w:r>
-        <w:t xml:space="preserve">“Discussion”</w:t>
-      </w:r>
-      <w:r>
-        <w:t xml:space="preserve"> </w:t>
-      </w:r>
-      <w:r>
-        <w:t xml:space="preserve">subtitle:</w:t>
-      </w:r>
-      <w:r>
-        <w:t xml:space="preserve"> </w:t>
-      </w:r>
-      <w:r>
-        <w:t xml:space="preserve">“Implications politiques, limites et perspectives”</w:t>
-      </w:r>
-      <w:r>
-        <w:t xml:space="preserve"> </w:t>
-      </w:r>
-      <w:r>
-        <w:t xml:space="preserve">—</w:t>
+        <w:t xml:space="preserve">Implications politiques, limites et perspectives</w:t>
+      </w:r>
+    </w:p>
+    <w:p>
+      <w:pPr>
+        <w:pStyle w:val="BodyText"/>
+      </w:pPr>
+      <w:r>
+        <w:br/>
       </w:r>
     </w:p>
     <w:bookmarkEnd w:id="154"/>
@@ -11806,44 +11790,6 @@
         <w:t xml:space="preserve">Les résultats de cette analyse constituent une estimation de première génération qui motive, et sera affinée par, l’analyse au niveau des ménages prévue pour 2026.</w:t>
       </w:r>
     </w:p>
-    <w:p>
-      <w:pPr>
-        <w:pStyle w:val="SourceCode"/>
-      </w:pPr>
-      <w:r>
-        <w:br/>
-      </w:r>
-      <w:r>
-        <w:br/>
-      </w:r>
-      <w:r>
-        <w:rPr>
-          <w:rStyle w:val="VerbatimChar"/>
-        </w:rPr>
-        <w:t xml:space="preserve">`&lt;!-- quarto-file-metadata: eyJyZXNvdXJjZURpciI6Ii4ifQ== --&gt;`{=html}</w:t>
-      </w:r>
-      <w:r>
-        <w:br/>
-      </w:r>
-      <w:r>
-        <w:br/>
-      </w:r>
-      <w:r>
-        <w:rPr>
-          <w:rStyle w:val="VerbatimChar"/>
-        </w:rPr>
-        <w:t xml:space="preserve">```{=html}</w:t>
-      </w:r>
-      <w:r>
-        <w:br/>
-      </w:r>
-      <w:r>
-        <w:rPr>
-          <w:rStyle w:val="VerbatimChar"/>
-        </w:rPr>
-        <w:t xml:space="preserve">&lt;!-- quarto-file-metadata: eyJyZXNvdXJjZURpciI6Ii4iLCJib29rSXRlbVR5cGUiOiJjaGFwdGVyIiwiYm9va0l0ZW1OdW1iZXIiOm51bGwsImJvb2tJdGVtRmlsZSI6InJlZmVyZW5jZXMuZnIucW1kIiwiYm9va0l0ZW1EZXB0aCI6MH0= --&gt;</w:t>
-      </w:r>
-    </w:p>
     <w:bookmarkEnd w:id="165"/>
     <w:bookmarkStart w:id="166" w:name="références"/>
     <w:p>
@@ -12051,13 +11997,13 @@
       </w:r>
     </w:p>
     <w:bookmarkEnd w:id="172"/>
-    <w:bookmarkStart w:id="173" w:name="quarto-1"/>
+    <w:bookmarkStart w:id="173" w:name="méthodologie"/>
     <w:p>
       <w:pPr>
         <w:pStyle w:val="Heading1"/>
       </w:pPr>
       <w:r>
-        <w:t xml:space="preserve">Appendix D — ```quarto</w:t>
+        <w:t xml:space="preserve">Appendix D — Méthodologie</w:t>
       </w:r>
     </w:p>
     <w:p>
@@ -12065,31 +12011,15 @@
         <w:pStyle w:val="FirstParagraph"/>
       </w:pPr>
       <w:r>
-        <w:t xml:space="preserve">title:</w:t>
-      </w:r>
-      <w:r>
-        <w:t xml:space="preserve"> </w:t>
-      </w:r>
-      <w:r>
-        <w:t xml:space="preserve">“Méthodologie”</w:t>
-      </w:r>
-      <w:r>
-        <w:t xml:space="preserve"> </w:t>
-      </w:r>
-      <w:r>
-        <w:t xml:space="preserve">subtitle:</w:t>
-      </w:r>
-      <w:r>
-        <w:t xml:space="preserve"> </w:t>
-      </w:r>
-      <w:r>
-        <w:t xml:space="preserve">“Détails techniques sur les méthodes d’estimation”</w:t>
-      </w:r>
-      <w:r>
-        <w:t xml:space="preserve"> </w:t>
-      </w:r>
-      <w:r>
-        <w:t xml:space="preserve">—</w:t>
+        <w:t xml:space="preserve">Détails techniques sur les méthodes d’estimation</w:t>
+      </w:r>
+    </w:p>
+    <w:p>
+      <w:pPr>
+        <w:pStyle w:val="BodyText"/>
+      </w:pPr>
+      <w:r>
+        <w:br/>
       </w:r>
     </w:p>
     <w:p>
@@ -13366,12 +13296,6 @@
       </w:r>
       <w:r>
         <w:t xml:space="preserve">, qui pondère à la fois les unités témoins et les périodes pré-traitement pour construire une tendance préliminaire commune entre les unités exposées et le pool de donneurs.</w:t>
-      </w:r>
-      <w:r>
-        <w:t xml:space="preserve"> </w:t>
-      </w:r>
-      <w:r>
-        <w:t xml:space="preserve">```</w:t>
       </w:r>
     </w:p>
     <w:bookmarkStart w:id="200" w:name="refs"/>

</xml_diff>

<commit_message>
fix: add att_ala CI vars to _variables.yml, update EN/FR text, resolve duplicate sec IDs
</commit_message>
<xml_diff>
--- a/docs/fr/rural-obs-PAs.docx
+++ b/docs/fr/rural-obs-PAs.docx
@@ -6096,7 +6096,7 @@
       </w:r>
     </w:p>
     <w:bookmarkEnd w:id="78"/>
-    <w:bookmarkStart w:id="79" w:name="sec-outcome"/>
+    <w:bookmarkStart w:id="79" w:name="sec-outcome-strategy"/>
     <w:p>
       <w:pPr>
         <w:pStyle w:val="Heading2"/>
@@ -9831,30 +9831,7 @@
         <w:pStyle w:val="BodyText"/>
       </w:pPr>
       <w:r>
-        <w:t xml:space="preserve">Le modèle gsynth pour Alaotra produit un ATT moyen de +0.014 points de log, statistiquement indiscernable de zéro (IC 95% : [</w:t>
-      </w:r>
-      <w:r>
-        <w:rPr>
-          <w:b/>
-          <w:bCs/>
-        </w:rPr>
-        <w:t xml:space="preserve">?var:att_ala_ci_lo</w:t>
-      </w:r>
-      <w:r>
-        <w:t xml:space="preserve">,</w:t>
-      </w:r>
-      <w:r>
-        <w:t xml:space="preserve"> </w:t>
-      </w:r>
-      <w:r>
-        <w:rPr>
-          <w:b/>
-          <w:bCs/>
-        </w:rPr>
-        <w:t xml:space="preserve">?var:att_ala_ci_hi</w:t>
-      </w:r>
-      <w:r>
-        <w:t xml:space="preserve">],</w:t>
+        <w:t xml:space="preserve">Le modèle gsynth pour Alaotra produit un ATT moyen de +0.014 points de log, statistiquement indiscernable de zéro (IC 95% : [-0.303, +0.333],</w:t>
       </w:r>
       <w:r>
         <w:t xml:space="preserve"> </w:t>

</xml_diff>